<commit_message>
last some bug fixes
</commit_message>
<xml_diff>
--- a/psc-self-assessment.docx
+++ b/psc-self-assessment.docx
@@ -1698,7 +1698,23 @@
                 <w:bCs/>
                 <w:lang w:val="de-DE"/>
               </w:rPr>
-              <w:t>Auflistung alles neuen Anträge und bestehender Mitglieder</w:t>
+              <w:t>Auflistung alle</w:t>
+            </w:r>
+            <w:r>
+              <w:rPr>
+                <w:rFonts w:asciiTheme="majorHAnsi" w:hAnsiTheme="majorHAnsi" w:cstheme="majorHAnsi"/>
+                <w:bCs/>
+                <w:lang w:val="de-DE"/>
+              </w:rPr>
+              <w:t>r</w:t>
+            </w:r>
+            <w:r>
+              <w:rPr>
+                <w:rFonts w:asciiTheme="majorHAnsi" w:hAnsiTheme="majorHAnsi" w:cstheme="majorHAnsi"/>
+                <w:bCs/>
+                <w:lang w:val="de-DE"/>
+              </w:rPr>
+              <w:t xml:space="preserve"> neuen Anträge und bestehender Mitglieder</w:t>
             </w:r>
           </w:p>
           <w:p>

</xml_diff>